<commit_message>
docs: align video demo script with RGPD gate, StartJobs, and ReAct tools
</commit_message>
<xml_diff>
--- a/docs/Guion_Video_Demo_TFM_Clinica_Neclatrony.docx
+++ b/docs/Guion_Video_Demo_TFM_Clinica_Neclatrony.docx
@@ -53,7 +53,7 @@
               </w:rPr>
               <w:t>Hiperautomatización Integral de Citas Clínicas | Clínica Dental Neclatrony</w:t>
               <w:br/>
-              <w:t>Duración estimada: 3:30 - 4:00 minutos | Formato: Screencast con locución</w:t>
+              <w:t>Duración estimada: 3:30 - 4:00 minutos | Formato: Screencast con locución y pantalla dividida</w:t>
             </w:r>
           </w:p>
         </w:tc>
@@ -128,7 +128,7 @@
         <w:t xml:space="preserve">Lado Izquierdo (50% pantalla): </w:t>
       </w:r>
       <w:r>
-        <w:t>Telegram Desktop con el chat de Sofía (@NeclatronyDentalBot) listo. Opcional: tener visible o anclado el grupo 'Recepción Clínica Neclatrony' (-5137407308).</w:t>
+        <w:t>Telegram Desktop con el chat de Sofía (@NeclatronyDentalBot) listo. Tener visible o anclado el grupo 'Recepción Clínica Neclatrony' (-5137407308).</w:t>
       </w:r>
     </w:p>
     <w:p>
@@ -143,7 +143,7 @@
         <w:t xml:space="preserve">Lado Derecho (50% pantalla): </w:t>
       </w:r>
       <w:r>
-        <w:t>Navegador web con el Mock ERP en la pestaña 'Agenda' (http://72.61.24.118:8080/). Ten seleccionada la semana actual para ver el impacto de los turnos.</w:t>
+        <w:t>Navegador web con el Mock ERP en la pestaña 'Agenda' (http://72.61.24.118:8080/). Ten seleccionada la semana actual para ver el impacto de los turnos en tiempo real.</w:t>
       </w:r>
     </w:p>
     <w:p>
@@ -321,7 +321,7 @@
               <w:t>0:00 - 0:25</w:t>
               <w:br/>
               <w:br/>
-              <w:t>Introducción y Arquitectura</w:t>
+              <w:t>Introducción y Gobernanza RGPD</w:t>
             </w:r>
           </w:p>
         </w:tc>
@@ -348,9 +348,9 @@
               </w:rPr>
               <w:t>Pantalla dividida:</w:t>
               <w:br/>
-              <w:t>• Izq: Telegram bot.</w:t>
+              <w:t>• Izq: Telegram bot con aviso de RGPD y botón interactivo [✅ Acepto el tratamiento de datos] (puedes activarlo con /reset_rgpd).</w:t>
               <w:br/>
-              <w:t>• Der: Mock ERP Agenda con citas cargadas (80% capacidad).</w:t>
+              <w:t>• Der: Mock ERP Agenda.</w:t>
             </w:r>
           </w:p>
         </w:tc>
@@ -376,7 +376,7 @@
                 <w:color w:val="1A202C"/>
                 <w:sz w:val="17"/>
               </w:rPr>
-              <w:t>«Buenos días. Presento la solución de hiperautomatización de Clínica Neclatrony. A la izquierda vemos al paciente interactuando con la agente inteligente Sofía vía Telegram, y a la derecha nuestro ERP clínico legado, sincronizado bidireccionalmente mediante n8n, Supabase y UiPath.»</w:t>
+              <w:t>«Buenos días. Presento la solución de hiperautomatización de Clínica Neclatrony. Comenzamos por la gobernanza: el sistema bloquea cualquier atención a nuevos usuarios hasta que otorgan su consentimiento explícito conforme al Art. 9 del RGPD. Al pulsar el botón, n8n registra el consentimiento en Supabase y Sofía nos da la bienvenida asistencial.»</w:t>
             </w:r>
           </w:p>
         </w:tc>
@@ -401,7 +401,9 @@
                 <w:color w:val="1A202C"/>
                 <w:sz w:val="17"/>
               </w:rPr>
-              <w:t>Vista global del ERP y Telegram sin demoras.</w:t>
+              <w:t>• Telegram confirma registro RGPD.</w:t>
+              <w:br/>
+              <w:t>• Sofía habilita el chat médico.</w:t>
             </w:r>
           </w:p>
         </w:tc>
@@ -487,7 +489,7 @@
                 <w:color w:val="1A202C"/>
                 <w:sz w:val="17"/>
               </w:rPr>
-              <w:t>«Comenzamos evaluando el motor de RAG y base de conocimiento. Sofía consulta los protocolos clínicos y tarifarios vectorizados, respondiendo en segundos el precio exacto del implante y confirmando la cobertura con Sanitas Dental sin invenciones.»</w:t>
+              <w:t>«Evaluamos ahora el motor RAG clínico. Sofía consulta los protocolos y tarifas vectorizados en Supabase pgvector con embeddings de 1.536 dimensiones, respondiendo en segundos el precio exacto del implante y confirmando la cobertura con Sanitas Dental sin alucinaciones.»</w:t>
             </w:r>
           </w:p>
         </w:tc>
@@ -512,7 +514,7 @@
                 <w:color w:val="1A202C"/>
                 <w:sz w:val="17"/>
               </w:rPr>
-              <w:t>Sofía responde con el precio exacto (ej. 850€) y condiciones de Sanitas.</w:t>
+              <w:t>Sofía responde con el precio exacto (desde 590€ + corona) y coberturas Sanitas.</w:t>
             </w:r>
           </w:p>
         </w:tc>
@@ -598,7 +600,7 @@
                 <w:color w:val="1A202C"/>
                 <w:sz w:val="17"/>
               </w:rPr>
-              <w:t>«El paciente solicita turno. Sofía valida que no existe en el registro, lo da de alta automáticamente en la base de datos Supabase, reserva el slot en el calendario y emite el ID de cita. Inmediatamente vemos cómo a la derecha el ERP actualiza la celda a color ocupado con el nombre de Carlos.»</w:t>
+              <w:t>«El paciente solicita turno. Sofía da de alta al paciente en Supabase y activa la mitigación de latencia: vemos el typing inmediato y el aviso 'Estamos registrando tu turno...'. En paralelo dispara la API StartJobs de UiPath Orchestrator, e inmediatamente a la derecha vemos cómo el slot de las 10:00 se ocupa en el Mock ERP con el nombre de Carlos.»</w:t>
             </w:r>
           </w:p>
         </w:tc>
@@ -623,9 +625,9 @@
                 <w:color w:val="1A202C"/>
                 <w:sz w:val="17"/>
               </w:rPr>
-              <w:t>• Telegram entrega cita NEC-XXXX.</w:t>
+              <w:t>• Feedback asíncrono inmediato.</w:t>
               <w:br/>
-              <w:t>• ERP actualiza el slot a ocupado.</w:t>
+              <w:t>• Slot ocupado en tiempo real en ERP.</w:t>
             </w:r>
           </w:p>
         </w:tc>
@@ -711,7 +713,7 @@
                 <w:color w:val="1A202C"/>
                 <w:sz w:val="17"/>
               </w:rPr>
-              <w:t>«Para comprobar la consistencia ante concurrencia, otra paciente intenta solicitar exactamente el mismo horario. Sofía detecta de inmediato el conflicto de disponibilidad, le notifica que las 10:00 ya están ocupadas y le ofrece proactivamente alternativas libres a las 10:30 o 11:00.»</w:t>
+              <w:t>«Para verificar la concurrencia, otra paciente solicita exactamente el mismo horario. Sofía detecta el conflicto en Supabase, previene la doble reserva ('Anti-Double Booking') y le ofrece proactivamente huecos libres contiguos a las 10:30 o las 11:00.»</w:t>
             </w:r>
           </w:p>
         </w:tc>
@@ -736,7 +738,7 @@
                 <w:color w:val="1A202C"/>
                 <w:sz w:val="17"/>
               </w:rPr>
-              <w:t>Sofía rechaza el slot ocupado y sugiere horarios contiguos disponibles.</w:t>
+              <w:t>Sofía rechaza el slot ocupado y sugiere horarios disponibles.</w:t>
             </w:r>
           </w:p>
         </w:tc>
@@ -794,7 +796,7 @@
                 <w:color w:val="1A202C"/>
                 <w:sz w:val="17"/>
               </w:rPr>
-              <w:t>Muestras el mensaje de recordatorio con botones interactivos y pulsas:</w:t>
+              <w:t>Muestras el mensaje de recordatorio saliente con botones interactivos y pulsas:</w:t>
               <w:br/>
               <w:t>[✅ Confirmar Asistencia]</w:t>
             </w:r>
@@ -822,7 +824,7 @@
                 <w:color w:val="1A202C"/>
                 <w:sz w:val="17"/>
               </w:rPr>
-              <w:t>«El sistema incluye campañas de recordatorio preventivas. El paciente recibe el aviso con botones dinámicos. Al pulsar 'Confirmar Asistencia', n8n intercepta la orden, actualiza Supabase y dispara un proceso desatendido en UiPath Orchestrator, el cual navega al ERP legacy y marca la cita como confirmada.»</w:t>
+              <w:t>«El sistema incluye campañas automáticas de recordatorios 24h. Al pulsar 'Confirmar Asistencia', el Normalizador de n8n intercepta determinísticamente la orden, actualiza Supabase a CONFIRMADA y dispara UiPath vía StartJobs. Vemos en el ERP cómo la cita cambia a color verde de confirmada.»</w:t>
             </w:r>
           </w:p>
         </w:tc>
@@ -847,7 +849,7 @@
                 <w:color w:val="1A202C"/>
                 <w:sz w:val="17"/>
               </w:rPr>
-              <w:t>• Badge en Telegram: 'Cita confirmada'.</w:t>
+              <w:t>• Badge en Telegram: Cita confirmada.</w:t>
               <w:br/>
               <w:t>• ERP actualiza estado a 'Confirmada'.</w:t>
             </w:r>
@@ -935,7 +937,7 @@
                 <w:color w:val="1A202C"/>
                 <w:sz w:val="17"/>
               </w:rPr>
-              <w:t>«Si el paciente no puede acudir, solicita la cancelación o cambio por lenguaje natural. Sofía libera el turno en Supabase e instruye a UiPath para reflejar la cancelación en el ERP legacy. Vemos cómo el slot de las 10:00 vuelve a quedar disponible de inmediato para otros pacientes.»</w:t>
+              <w:t>«Si el paciente solicita cancelar o cambiar el turno, Sofía interpreta el lenguaje natural mediante su algoritmo multi-estrategia, libera el turno en Supabase e instruye a UiPath. El slot en el Mock ERP vuelve a quedar disponible de inmediato para otros pacientes.»</w:t>
             </w:r>
           </w:p>
         </w:tc>
@@ -960,9 +962,9 @@
                 <w:color w:val="1A202C"/>
                 <w:sz w:val="17"/>
               </w:rPr>
-              <w:t>• Sofía confirma cancelación.</w:t>
+              <w:t>• Confirmación de baja.</w:t>
               <w:br/>
-              <w:t>• Slot en ERP se libera en tiempo real.</w:t>
+              <w:t>• Slot en ERP se libera en vivo.</w:t>
             </w:r>
           </w:p>
         </w:tc>
@@ -1022,7 +1024,7 @@
               </w:rPr>
               <w:t>En Telegram escribes:</w:t>
               <w:br/>
-              <w:t>«¡Por favor ayuda! Mi hijo se golpeó la boca, sangra mucho y se le partió un diente.»</w:t>
+              <w:t>«¡Por favor ayuda! Mi hijo se cayó en bicicleta, sangra mucho y se le partió un diente.»</w:t>
               <w:br/>
               <w:br/>
               <w:t>Luego cambias al grupo 'Recepción Clínica Neclatrony'.</w:t>
@@ -1051,7 +1053,7 @@
                 <w:color w:val="1A202C"/>
                 <w:sz w:val="17"/>
               </w:rPr>
-              <w:t>«Un aspecto crítico es el triaje clínico y manejo de excepciones. Ante síntomas de alarma o dolor agudo, Sofía clasifica el caso como Código Rojo de Urgencia. En lugar de procesar una cita ordinaria, activa el protocolo Human-in-the-Loop: detiene la respuesta automática y envía una alerta prioritaria instantánea al grupo de recepción con los datos del paciente para contacto telefónico urgente.»</w:t>
+              <w:t>«El punto más crítico: triaje médico y manejo de excepciones. Ante un traumatismo agudo, Sofía clasifica el caso como Código Rojo de Urgencia. Detiene la respuesta comercial y activa el protocolo Human-in-the-Loop: envía pautas de hemostasia y despacha una alerta sonora inmediata al grupo privado de recepción con el contacto directo del paciente.»</w:t>
             </w:r>
           </w:p>
         </w:tc>
@@ -1076,7 +1078,7 @@
                 <w:color w:val="1A202C"/>
                 <w:sz w:val="17"/>
               </w:rPr>
-              <w:t>• Alerta roja inmediata en el grupo de recepción (-5137407308) con teléfono y motivo.</w:t>
+              <w:t>• Alerta roja instantánea en grupo de recepción (-5137407308) con teléfono.</w:t>
             </w:r>
           </w:p>
         </w:tc>
@@ -1136,7 +1138,7 @@
               </w:rPr>
               <w:t>Cambias pestaña a:</w:t>
               <w:br/>
-              <w:t>1. Flujo n8n (zoom a nodos AI Agent, Tools y Error Trigger).</w:t>
+              <w:t>1. Flujo n8n (zoom al Agente ReAct unificado Sofía y sus 8 Tools).</w:t>
               <w:br/>
               <w:t>2. Supabase (tabla clinica_citas).</w:t>
             </w:r>
@@ -1164,7 +1166,7 @@
                 <w:color w:val="1A202C"/>
                 <w:sz w:val="17"/>
               </w:rPr>
-              <w:t>«En la trastienda técnica, vemos el workflow en n8n orquestando los LLMs con OpenAI y vector store para RAG, mientras Supabase garantiza la integridad referencial y UiPath asegura interoperabilidad con el software histórico de la clínica. En conclusión, una solución robusta, segura y medible. Muchas gracias.»</w:t>
+              <w:t>«En la trastienda técnica, vemos el workflow en n8n implementando un Agente ReAct unificado con 8 Tools deterministas, mientras Supabase garantiza la integridad relacional y vectorial, y UiPath asegura la integración no invasiva con el ERP existente. Muchas gracias.»</w:t>
             </w:r>
           </w:p>
         </w:tc>
@@ -1244,7 +1246,7 @@
         <w:t xml:space="preserve">1. Excepción de Negocio (Slots ocupados / Doble cita): </w:t>
       </w:r>
       <w:r>
-        <w:t>El n8n Tool captura el código 409 de Supabase o la falta de disponibilidad y Sofía sugiere alternativas sin arrojar un error técnico.</w:t>
+        <w:t>El n8n Tool captura la restricción de Supabase (idx_cita_activa_especialidad) o la falta de disponibilidad y Sofía sugiere alternativas sin arrojar un error técnico.</w:t>
       </w:r>
     </w:p>
     <w:p>
@@ -1274,7 +1276,7 @@
         <w:t xml:space="preserve">3. Excepción de Sistema / Fallo UiPath / Timeout: </w:t>
       </w:r>
       <w:r>
-        <w:t>Si el robot RPA no encuentra el selector o el ERP no responde, el nodo 'Error Trigger' de n8n dispara una alerta a recepción indicando 'Intervención Manual Requerida' con los datos de la cita para que secretaría no pierda el turno.</w:t>
+        <w:t>Si el robot RPA no encuentra el selector o el ERP no responde, el Normalizador/Error Trigger de n8n dispara una alerta estructurada a recepción indicando 'Intervención Manual Requerida' con los datos completos del paciente para que secretaría no pierda el turno.</w:t>
       </w:r>
     </w:p>
     <w:p>
@@ -1298,7 +1300,16 @@
         <w:spacing w:after="40"/>
       </w:pPr>
       <w:r>
-        <w:t>• Ten la ventana de Telegram con un zoom cómodo (Ctrl + rueda del ratón) para que las respuestas del bot se lean claramente en el vídeo.</w:t>
+        <w:t>• Si quieres mostrar la pantalla de consentimiento RGPD desde cero en el vídeo, envía primero el comando /reset_rgpd a Sofía para que vuelva a pedir el consentimiento con el botón.</w:t>
+      </w:r>
+    </w:p>
+    <w:p>
+      <w:pPr>
+        <w:pStyle w:val="ListBullet"/>
+        <w:spacing w:after="40"/>
+      </w:pPr>
+      <w:r>
+        <w:t>• Ten la ventana de Telegram con un zoom cómodo (Ctrl + rueda del ratón) para que las respuestas del bot y las alertas de recepción se lean claramente en el vídeo.</w:t>
       </w:r>
     </w:p>
     <w:p>

</xml_diff>

<commit_message>
docs: unify financial figures (183k), UiPath Job Queue concurrency, and HITL urgency DNI across all 3 deliverables
</commit_message>
<xml_diff>
--- a/docs/Guion_Video_Demo_TFM_Clinica_Neclatrony.docx
+++ b/docs/Guion_Video_Demo_TFM_Clinica_Neclatrony.docx
@@ -997,7 +997,7 @@
               <w:br/>
               <w:t>Caso 8 y Manejo de Errores:</w:t>
               <w:br/>
-              <w:t>Urgencia (Human-in-the-Loop)</w:t>
+              <w:t>Urgencia (HITL) con DNI</w:t>
             </w:r>
           </w:p>
         </w:tc>
@@ -1024,7 +1024,7 @@
               </w:rPr>
               <w:t>En Telegram escribes:</w:t>
               <w:br/>
-              <w:t>«¡Por favor ayuda! Mi hijo se cayó en bicicleta, sangra mucho y se le partió un diente.»</w:t>
+              <w:t>«¡Por favor ayuda! Me caí en bicicleta, sangro mucho y se me rompió un diente frontal. Mi DNI es 38522432»</w:t>
               <w:br/>
               <w:br/>
               <w:t>Luego cambias al grupo 'Recepción Clínica Neclatrony'.</w:t>
@@ -1053,7 +1053,7 @@
                 <w:color w:val="1A202C"/>
                 <w:sz w:val="17"/>
               </w:rPr>
-              <w:t>«El punto más crítico: triaje médico y manejo de excepciones. Ante un traumatismo agudo, Sofía clasifica el caso como Código Rojo de Urgencia. Detiene la respuesta comercial y activa el protocolo Human-in-the-Loop: envía pautas de hemostasia y despacha una alerta sonora inmediata al grupo privado de recepción con el contacto directo del paciente.»</w:t>
+              <w:t>«El punto más crítico: triaje médico y manejo de excepciones. Ante un traumatismo agudo, el paciente aporta su DNI. Sofía clasifica la urgencia en Código Rojo, consulta la ficha en Supabase para vincular su historial médico y despacha una alerta sonora inmediata al grupo privado de recepción con nombre, DNI y teléfono para un contacto telefónico urgente y personalizado.»</w:t>
             </w:r>
           </w:p>
         </w:tc>
@@ -1078,7 +1078,7 @@
                 <w:color w:val="1A202C"/>
                 <w:sz w:val="17"/>
               </w:rPr>
-              <w:t>• Alerta roja instantánea en grupo de recepción (-5137407308) con teléfono.</w:t>
+              <w:t>• Alerta roja instantánea en grupo de recepción (-5137407308) con: Paciente: Sabrina Esposito, DNI: 38522432, Teléfono y síntomas.</w:t>
             </w:r>
           </w:p>
         </w:tc>

</xml_diff>